<commit_message>
To Implement User Panel Dashboard(http://localhost:5173/dashboard/user) and User Type=3
</commit_message>
<xml_diff>
--- a/document/check-user-type.docx
+++ b/document/check-user-type.docx
@@ -9,13 +9,30 @@
       </w:r>
     </w:p>
     <w:p>
-      <w:r>
-        <w:t>Username : itm.root</w:t>
-      </w:r>
-    </w:p>
-    <w:p>
-      <w:r>
-        <w:t xml:space="preserve">Password : </w:t>
+      <w:proofErr w:type="gramStart"/>
+      <w:r>
+        <w:t>Username :</w:t>
+      </w:r>
+      <w:proofErr w:type="gramEnd"/>
+      <w:r>
+        <w:t xml:space="preserve"> </w:t>
+      </w:r>
+      <w:proofErr w:type="spellStart"/>
+      <w:proofErr w:type="gramStart"/>
+      <w:r>
+        <w:t>itm.root</w:t>
+      </w:r>
+      <w:proofErr w:type="spellEnd"/>
+      <w:proofErr w:type="gramEnd"/>
+    </w:p>
+    <w:p>
+      <w:proofErr w:type="gramStart"/>
+      <w:r>
+        <w:t>Password :</w:t>
+      </w:r>
+      <w:proofErr w:type="gramEnd"/>
+      <w:r>
+        <w:t xml:space="preserve"> </w:t>
       </w:r>
       <w:r>
         <w:t>f@hrt1@itm_new</w:t>
@@ -27,16 +44,26 @@
       </w:r>
     </w:p>
     <w:p>
-      <w:r>
-        <w:t xml:space="preserve">username : </w:t>
+      <w:proofErr w:type="gramStart"/>
+      <w:r>
+        <w:t>username :</w:t>
+      </w:r>
+      <w:proofErr w:type="gramEnd"/>
+      <w:r>
+        <w:t xml:space="preserve"> </w:t>
       </w:r>
       <w:r>
         <w:t>admin</w:t>
       </w:r>
     </w:p>
     <w:p>
-      <w:r>
-        <w:t xml:space="preserve">Password : </w:t>
+      <w:proofErr w:type="gramStart"/>
+      <w:r>
+        <w:t>Password :</w:t>
+      </w:r>
+      <w:proofErr w:type="gramEnd"/>
+      <w:r>
+        <w:t xml:space="preserve"> </w:t>
       </w:r>
       <w:r>
         <w:t>Admin@1234</w:t>
@@ -48,16 +75,30 @@
       </w:r>
     </w:p>
     <w:p>
-      <w:r>
-        <w:t xml:space="preserve">Username : </w:t>
-      </w:r>
+      <w:proofErr w:type="gramStart"/>
+      <w:r>
+        <w:t>Username :</w:t>
+      </w:r>
+      <w:proofErr w:type="gramEnd"/>
+      <w:r>
+        <w:t xml:space="preserve"> </w:t>
+      </w:r>
+      <w:proofErr w:type="spellStart"/>
+      <w:proofErr w:type="gramStart"/>
       <w:r>
         <w:t>test.itpersonnel</w:t>
       </w:r>
-    </w:p>
-    <w:p>
-      <w:r>
-        <w:t xml:space="preserve">Password : </w:t>
+      <w:proofErr w:type="spellEnd"/>
+      <w:proofErr w:type="gramEnd"/>
+    </w:p>
+    <w:p>
+      <w:proofErr w:type="gramStart"/>
+      <w:r>
+        <w:t>Password :</w:t>
+      </w:r>
+      <w:proofErr w:type="gramEnd"/>
+      <w:r>
+        <w:t xml:space="preserve"> </w:t>
       </w:r>
       <w:r>
         <w:t>f@hrt1@itm_itprs</w:t>
@@ -69,16 +110,30 @@
       </w:r>
     </w:p>
     <w:p>
-      <w:r>
-        <w:t xml:space="preserve">Username : </w:t>
-      </w:r>
+      <w:proofErr w:type="gramStart"/>
+      <w:r>
+        <w:t>Username :</w:t>
+      </w:r>
+      <w:proofErr w:type="gramEnd"/>
+      <w:r>
+        <w:t xml:space="preserve"> </w:t>
+      </w:r>
+      <w:proofErr w:type="spellStart"/>
+      <w:proofErr w:type="gramStart"/>
       <w:r>
         <w:t>test.general</w:t>
       </w:r>
-    </w:p>
-    <w:p>
-      <w:r>
-        <w:t xml:space="preserve">Password : </w:t>
+      <w:proofErr w:type="spellEnd"/>
+      <w:proofErr w:type="gramEnd"/>
+    </w:p>
+    <w:p>
+      <w:proofErr w:type="gramStart"/>
+      <w:r>
+        <w:t>Password :</w:t>
+      </w:r>
+      <w:proofErr w:type="gramEnd"/>
+      <w:r>
+        <w:t xml:space="preserve"> </w:t>
       </w:r>
       <w:r>
         <w:t>f@hrt1@itm_guser</w:t>
@@ -103,75 +158,234 @@
     </w:p>
     <w:p>
       <w:r>
-        <w:t xml:space="preserve">    u.employee_id,</w:t>
-      </w:r>
-    </w:p>
-    <w:p>
-      <w:r>
-        <w:t xml:space="preserve">    u.username,</w:t>
-      </w:r>
-    </w:p>
-    <w:p>
-      <w:r>
-        <w:t xml:space="preserve">    u.user_type,</w:t>
-      </w:r>
-    </w:p>
-    <w:p>
-      <w:r>
-        <w:t xml:space="preserve">    u.active,</w:t>
-      </w:r>
-    </w:p>
-    <w:p>
-      <w:r>
-        <w:t xml:space="preserve">    u.account_status,</w:t>
-      </w:r>
-    </w:p>
-    <w:p>
-      <w:r>
-        <w:t xml:space="preserve">    r.code AS role_code,</w:t>
-      </w:r>
-    </w:p>
-    <w:p>
-      <w:r>
-        <w:t xml:space="preserve">    r.name AS role_name</w:t>
-      </w:r>
-    </w:p>
-    <w:p>
-      <w:r>
-        <w:t>FROM public.users AS u</w:t>
-      </w:r>
-    </w:p>
-    <w:p/>
-    <w:p>
-      <w:r>
-        <w:t>LEFT JOIN public.auth_user_roles AS ur</w:t>
-      </w:r>
-    </w:p>
-    <w:p>
-      <w:r>
-        <w:t xml:space="preserve">    ON ur.user_id = u.id</w:t>
-      </w:r>
-    </w:p>
-    <w:p>
-      <w:r>
-        <w:t xml:space="preserve">    AND ur.active = TRUE</w:t>
-      </w:r>
-    </w:p>
-    <w:p/>
-    <w:p>
-      <w:r>
-        <w:t>LEFT JOIN public.auth_roles AS r</w:t>
-      </w:r>
-    </w:p>
-    <w:p>
-      <w:r>
-        <w:t xml:space="preserve">    ON r.id = ur.role_id</w:t>
-      </w:r>
-    </w:p>
-    <w:p/>
-    <w:p>
-      <w:r>
-        <w:t>WHERE u.deleted_at IS NULL</w:t>
+        <w:t xml:space="preserve">    </w:t>
+      </w:r>
+      <w:proofErr w:type="spellStart"/>
+      <w:proofErr w:type="gramStart"/>
+      <w:r>
+        <w:t>u.employee</w:t>
+      </w:r>
+      <w:proofErr w:type="gramEnd"/>
+      <w:r>
+        <w:t>_id</w:t>
+      </w:r>
+      <w:proofErr w:type="spellEnd"/>
+      <w:r>
+        <w:t>,</w:t>
+      </w:r>
+    </w:p>
+    <w:p>
+      <w:r>
+        <w:t xml:space="preserve">    </w:t>
+      </w:r>
+      <w:proofErr w:type="spellStart"/>
+      <w:proofErr w:type="gramStart"/>
+      <w:r>
+        <w:t>u.username</w:t>
+      </w:r>
+      <w:proofErr w:type="spellEnd"/>
+      <w:proofErr w:type="gramEnd"/>
+      <w:r>
+        <w:t>,</w:t>
+      </w:r>
+    </w:p>
+    <w:p>
+      <w:r>
+        <w:t xml:space="preserve">    </w:t>
+      </w:r>
+      <w:proofErr w:type="spellStart"/>
+      <w:r>
+        <w:t>u.user_type</w:t>
+      </w:r>
+      <w:proofErr w:type="spellEnd"/>
+      <w:r>
+        <w:t>,</w:t>
+      </w:r>
+    </w:p>
+    <w:p>
+      <w:r>
+        <w:t xml:space="preserve">    </w:t>
+      </w:r>
+      <w:proofErr w:type="spellStart"/>
+      <w:proofErr w:type="gramStart"/>
+      <w:r>
+        <w:t>u.active</w:t>
+      </w:r>
+      <w:proofErr w:type="spellEnd"/>
+      <w:proofErr w:type="gramEnd"/>
+      <w:r>
+        <w:t>,</w:t>
+      </w:r>
+    </w:p>
+    <w:p>
+      <w:r>
+        <w:t xml:space="preserve">    </w:t>
+      </w:r>
+      <w:proofErr w:type="spellStart"/>
+      <w:proofErr w:type="gramStart"/>
+      <w:r>
+        <w:t>u.account</w:t>
+      </w:r>
+      <w:proofErr w:type="gramEnd"/>
+      <w:r>
+        <w:t>_status</w:t>
+      </w:r>
+      <w:proofErr w:type="spellEnd"/>
+      <w:r>
+        <w:t>,</w:t>
+      </w:r>
+    </w:p>
+    <w:p>
+      <w:r>
+        <w:t xml:space="preserve">    </w:t>
+      </w:r>
+      <w:proofErr w:type="spellStart"/>
+      <w:proofErr w:type="gramStart"/>
+      <w:r>
+        <w:t>r.code</w:t>
+      </w:r>
+      <w:proofErr w:type="spellEnd"/>
+      <w:proofErr w:type="gramEnd"/>
+      <w:r>
+        <w:t xml:space="preserve"> AS </w:t>
+      </w:r>
+      <w:proofErr w:type="spellStart"/>
+      <w:r>
+        <w:t>role_code</w:t>
+      </w:r>
+      <w:proofErr w:type="spellEnd"/>
+      <w:r>
+        <w:t>,</w:t>
+      </w:r>
+    </w:p>
+    <w:p>
+      <w:r>
+        <w:t xml:space="preserve">    r.name AS </w:t>
+      </w:r>
+      <w:proofErr w:type="spellStart"/>
+      <w:r>
+        <w:t>role_name</w:t>
+      </w:r>
+      <w:proofErr w:type="spellEnd"/>
+    </w:p>
+    <w:p>
+      <w:r>
+        <w:t xml:space="preserve">FROM </w:t>
+      </w:r>
+      <w:proofErr w:type="spellStart"/>
+      <w:proofErr w:type="gramStart"/>
+      <w:r>
+        <w:t>public.users</w:t>
+      </w:r>
+      <w:proofErr w:type="spellEnd"/>
+      <w:proofErr w:type="gramEnd"/>
+      <w:r>
+        <w:t xml:space="preserve"> AS u</w:t>
+      </w:r>
+    </w:p>
+    <w:p/>
+    <w:p>
+      <w:r>
+        <w:t xml:space="preserve">LEFT JOIN </w:t>
+      </w:r>
+      <w:proofErr w:type="spellStart"/>
+      <w:proofErr w:type="gramStart"/>
+      <w:r>
+        <w:t>public.auth</w:t>
+      </w:r>
+      <w:proofErr w:type="gramEnd"/>
+      <w:r>
+        <w:t>_user_roles</w:t>
+      </w:r>
+      <w:proofErr w:type="spellEnd"/>
+      <w:r>
+        <w:t xml:space="preserve"> AS </w:t>
+      </w:r>
+      <w:proofErr w:type="spellStart"/>
+      <w:r>
+        <w:t>ur</w:t>
+      </w:r>
+      <w:proofErr w:type="spellEnd"/>
+    </w:p>
+    <w:p>
+      <w:r>
+        <w:t xml:space="preserve">    ON </w:t>
+      </w:r>
+      <w:proofErr w:type="spellStart"/>
+      <w:r>
+        <w:t>ur.user_id</w:t>
+      </w:r>
+      <w:proofErr w:type="spellEnd"/>
+      <w:r>
+        <w:t xml:space="preserve"> = u.id</w:t>
+      </w:r>
+    </w:p>
+    <w:p>
+      <w:r>
+        <w:t xml:space="preserve">    AND </w:t>
+      </w:r>
+      <w:proofErr w:type="spellStart"/>
+      <w:proofErr w:type="gramStart"/>
+      <w:r>
+        <w:t>ur.active</w:t>
+      </w:r>
+      <w:proofErr w:type="spellEnd"/>
+      <w:proofErr w:type="gramEnd"/>
+      <w:r>
+        <w:t xml:space="preserve"> = TRUE</w:t>
+      </w:r>
+    </w:p>
+    <w:p/>
+    <w:p>
+      <w:r>
+        <w:t xml:space="preserve">LEFT JOIN </w:t>
+      </w:r>
+      <w:proofErr w:type="spellStart"/>
+      <w:proofErr w:type="gramStart"/>
+      <w:r>
+        <w:t>public.auth</w:t>
+      </w:r>
+      <w:proofErr w:type="gramEnd"/>
+      <w:r>
+        <w:t>_roles</w:t>
+      </w:r>
+      <w:proofErr w:type="spellEnd"/>
+      <w:r>
+        <w:t xml:space="preserve"> AS r</w:t>
+      </w:r>
+    </w:p>
+    <w:p>
+      <w:r>
+        <w:t xml:space="preserve">    ON r.id = </w:t>
+      </w:r>
+      <w:proofErr w:type="spellStart"/>
+      <w:proofErr w:type="gramStart"/>
+      <w:r>
+        <w:t>ur.role</w:t>
+      </w:r>
+      <w:proofErr w:type="gramEnd"/>
+      <w:r>
+        <w:t>_id</w:t>
+      </w:r>
+      <w:proofErr w:type="spellEnd"/>
+    </w:p>
+    <w:p/>
+    <w:p>
+      <w:r>
+        <w:t xml:space="preserve">WHERE </w:t>
+      </w:r>
+      <w:proofErr w:type="spellStart"/>
+      <w:proofErr w:type="gramStart"/>
+      <w:r>
+        <w:t>u.deleted</w:t>
+      </w:r>
+      <w:proofErr w:type="gramEnd"/>
+      <w:r>
+        <w:t>_at</w:t>
+      </w:r>
+      <w:proofErr w:type="spellEnd"/>
+      <w:r>
+        <w:t xml:space="preserve"> IS NULL</w:t>
       </w:r>
     </w:p>
     <w:p>
@@ -181,7 +395,15 @@
     </w:p>
     <w:p>
       <w:r>
-        <w:t xml:space="preserve">    u.user_type,</w:t>
+        <w:t xml:space="preserve">    </w:t>
+      </w:r>
+      <w:proofErr w:type="spellStart"/>
+      <w:r>
+        <w:t>u.user_type</w:t>
+      </w:r>
+      <w:proofErr w:type="spellEnd"/>
+      <w:r>
+        <w:t>,</w:t>
       </w:r>
     </w:p>
     <w:p>
@@ -192,6 +414,9 @@
     <w:p/>
     <w:p>
       <w:r>
+        <w:rPr>
+          <w:noProof/>
+        </w:rPr>
         <w:drawing>
           <wp:inline distT="0" distB="0" distL="0" distR="0" wp14:anchorId="383C2807" wp14:editId="265C6802">
             <wp:extent cx="5943600" cy="3189605"/>
@@ -246,7 +471,17 @@
       </w:r>
       <w:r>
         <w:tab/>
-        <w:t>"itm.root"</w:t>
+        <w:t>"</w:t>
+      </w:r>
+      <w:proofErr w:type="spellStart"/>
+      <w:proofErr w:type="gramStart"/>
+      <w:r>
+        <w:t>itm.root</w:t>
+      </w:r>
+      <w:proofErr w:type="spellEnd"/>
+      <w:proofErr w:type="gramEnd"/>
+      <w:r>
+        <w:t>"</w:t>
       </w:r>
       <w:r>
         <w:tab/>
@@ -312,7 +547,17 @@
       </w:r>
       <w:r>
         <w:tab/>
-        <w:t>"test.itpersonnel"</w:t>
+        <w:t>"</w:t>
+      </w:r>
+      <w:proofErr w:type="spellStart"/>
+      <w:proofErr w:type="gramStart"/>
+      <w:r>
+        <w:t>test.itpersonnel</w:t>
+      </w:r>
+      <w:proofErr w:type="spellEnd"/>
+      <w:proofErr w:type="gramEnd"/>
+      <w:r>
+        <w:t>"</w:t>
       </w:r>
       <w:r>
         <w:tab/>
@@ -345,7 +590,17 @@
       </w:r>
       <w:r>
         <w:tab/>
-        <w:t>"test.general"</w:t>
+        <w:t>"</w:t>
+      </w:r>
+      <w:proofErr w:type="spellStart"/>
+      <w:proofErr w:type="gramStart"/>
+      <w:r>
+        <w:t>test.general</w:t>
+      </w:r>
+      <w:proofErr w:type="spellEnd"/>
+      <w:proofErr w:type="gramEnd"/>
+      <w:r>
+        <w:t>"</w:t>
       </w:r>
       <w:r>
         <w:tab/>
@@ -381,26 +636,2054 @@
     </w:p>
     <w:p>
       <w:r>
-        <w:t>2,"ROOT-001","itm.root",0,True,"active","ROOT","Root / Super Administrator"</w:t>
-      </w:r>
-    </w:p>
-    <w:p>
-      <w:r>
-        <w:t>1,"ADMIN-001","admin",1,True,"active","IT_ADMIN","IT Administrator"</w:t>
-      </w:r>
-    </w:p>
-    <w:p>
-      <w:r>
-        <w:t>3,"TEST-IT-001","test.itpersonnel",2,True,"active","IT_PERSONNEL","IT Personnel"</w:t>
-      </w:r>
-    </w:p>
-    <w:p>
-      <w:r>
-        <w:t>4,"TEST-GEN-001","test.general",3,True,"active","GENERAL_USER","General User"</w:t>
-      </w:r>
-    </w:p>
-    <w:p/>
-    <w:p/>
+        <w:t>2,"ROOT-001","</w:t>
+      </w:r>
+      <w:proofErr w:type="gramStart"/>
+      <w:r>
+        <w:t>itm.root</w:t>
+      </w:r>
+      <w:proofErr w:type="gramEnd"/>
+      <w:r>
+        <w:t>",</w:t>
+      </w:r>
+      <w:proofErr w:type="gramStart"/>
+      <w:r>
+        <w:t>0,True</w:t>
+      </w:r>
+      <w:proofErr w:type="gramEnd"/>
+      <w:r>
+        <w:t>,"active","ROOT","Root / Super Administrator"</w:t>
+      </w:r>
+    </w:p>
+    <w:p>
+      <w:r>
+        <w:t>1,"ADMIN-001","admin",</w:t>
+      </w:r>
+      <w:proofErr w:type="gramStart"/>
+      <w:r>
+        <w:t>1,True</w:t>
+      </w:r>
+      <w:proofErr w:type="gramEnd"/>
+      <w:r>
+        <w:t>,"active","IT_ADMIN","IT Administrator"</w:t>
+      </w:r>
+    </w:p>
+    <w:p>
+      <w:r>
+        <w:t>3,"TEST-IT-001","</w:t>
+      </w:r>
+      <w:proofErr w:type="gramStart"/>
+      <w:r>
+        <w:t>test.itpersonnel</w:t>
+      </w:r>
+      <w:proofErr w:type="gramEnd"/>
+      <w:r>
+        <w:t>",</w:t>
+      </w:r>
+      <w:proofErr w:type="gramStart"/>
+      <w:r>
+        <w:t>2,True</w:t>
+      </w:r>
+      <w:proofErr w:type="gramEnd"/>
+      <w:r>
+        <w:t>,"active","IT_PERSONNEL","IT Personnel"</w:t>
+      </w:r>
+    </w:p>
+    <w:p>
+      <w:r>
+        <w:t>4,"TEST-GEN-001","</w:t>
+      </w:r>
+      <w:proofErr w:type="gramStart"/>
+      <w:r>
+        <w:t>test.general</w:t>
+      </w:r>
+      <w:proofErr w:type="gramEnd"/>
+      <w:r>
+        <w:t>",</w:t>
+      </w:r>
+      <w:proofErr w:type="gramStart"/>
+      <w:r>
+        <w:t>3,True</w:t>
+      </w:r>
+      <w:proofErr w:type="gramEnd"/>
+      <w:r>
+        <w:t>,"active","GENERAL_USER","General User"</w:t>
+      </w:r>
+    </w:p>
+    <w:p/>
+    <w:p/>
+    <w:p/>
+    <w:p/>
+    <w:p/>
+    <w:p/>
+    <w:p>
+      <w:proofErr w:type="gramStart"/>
+      <w:r>
+        <w:lastRenderedPageBreak/>
+        <w:t>Method :</w:t>
+      </w:r>
+      <w:proofErr w:type="gramEnd"/>
+      <w:r>
+        <w:t xml:space="preserve"> GET</w:t>
+      </w:r>
+    </w:p>
+    <w:p/>
+    <w:p>
+      <w:hyperlink r:id="rId5" w:history="1">
+        <w:r>
+          <w:rPr>
+            <w:rStyle w:val="Hyperlink"/>
+          </w:rPr>
+          <w:t>http://127.0.0.1:8080/api/v1/user/dashboard</w:t>
+        </w:r>
+      </w:hyperlink>
+    </w:p>
+    <w:p/>
+    <w:p>
+      <w:r>
+        <w:t>Post man result</w:t>
+      </w:r>
+    </w:p>
+    <w:p/>
+    <w:p/>
+    <w:p>
+      <w:r>
+        <w:t>{</w:t>
+      </w:r>
+    </w:p>
+    <w:p>
+      <w:r>
+        <w:t>    "data</w:t>
+      </w:r>
+      <w:proofErr w:type="gramStart"/>
+      <w:r>
+        <w:t>": {</w:t>
+      </w:r>
+      <w:proofErr w:type="gramEnd"/>
+    </w:p>
+    <w:p>
+      <w:r>
+        <w:t>        "employee</w:t>
+      </w:r>
+      <w:proofErr w:type="gramStart"/>
+      <w:r>
+        <w:t>": {</w:t>
+      </w:r>
+      <w:proofErr w:type="gramEnd"/>
+    </w:p>
+    <w:p>
+      <w:r>
+        <w:t>            "</w:t>
+      </w:r>
+      <w:proofErr w:type="spellStart"/>
+      <w:proofErr w:type="gramStart"/>
+      <w:r>
+        <w:t>employee</w:t>
+      </w:r>
+      <w:proofErr w:type="gramEnd"/>
+      <w:r>
+        <w:t>_id</w:t>
+      </w:r>
+      <w:proofErr w:type="spellEnd"/>
+      <w:r>
+        <w:t>": "ROOT-001",</w:t>
+      </w:r>
+    </w:p>
+    <w:p>
+      <w:r>
+        <w:t>            "</w:t>
+      </w:r>
+      <w:proofErr w:type="spellStart"/>
+      <w:proofErr w:type="gramStart"/>
+      <w:r>
+        <w:t>employee</w:t>
+      </w:r>
+      <w:proofErr w:type="gramEnd"/>
+      <w:r>
+        <w:t>_name</w:t>
+      </w:r>
+      <w:proofErr w:type="spellEnd"/>
+      <w:r>
+        <w:t>": "",</w:t>
+      </w:r>
+    </w:p>
+    <w:p>
+      <w:r>
+        <w:t>            "designation": "",</w:t>
+      </w:r>
+    </w:p>
+    <w:p>
+      <w:r>
+        <w:t>            "department": "",</w:t>
+      </w:r>
+    </w:p>
+    <w:p>
+      <w:r>
+        <w:t>            "</w:t>
+      </w:r>
+      <w:proofErr w:type="spellStart"/>
+      <w:proofErr w:type="gramStart"/>
+      <w:r>
+        <w:t>work</w:t>
+      </w:r>
+      <w:proofErr w:type="gramEnd"/>
+      <w:r>
+        <w:t>_field</w:t>
+      </w:r>
+      <w:proofErr w:type="spellEnd"/>
+      <w:r>
+        <w:t>": "",</w:t>
+      </w:r>
+    </w:p>
+    <w:p>
+      <w:r>
+        <w:t>            "</w:t>
+      </w:r>
+      <w:proofErr w:type="spellStart"/>
+      <w:proofErr w:type="gramStart"/>
+      <w:r>
+        <w:t>sub</w:t>
+      </w:r>
+      <w:proofErr w:type="gramEnd"/>
+      <w:r>
+        <w:t>_function</w:t>
+      </w:r>
+      <w:proofErr w:type="spellEnd"/>
+      <w:r>
+        <w:t>": "",</w:t>
+      </w:r>
+    </w:p>
+    <w:p>
+      <w:r>
+        <w:t>            "active": "",</w:t>
+      </w:r>
+    </w:p>
+    <w:p>
+      <w:r>
+        <w:t>            "</w:t>
+      </w:r>
+      <w:proofErr w:type="spellStart"/>
+      <w:proofErr w:type="gramStart"/>
+      <w:r>
+        <w:t>personal</w:t>
+      </w:r>
+      <w:proofErr w:type="gramEnd"/>
+      <w:r>
+        <w:t>_cell</w:t>
+      </w:r>
+      <w:proofErr w:type="spellEnd"/>
+      <w:r>
+        <w:t>": "",</w:t>
+      </w:r>
+    </w:p>
+    <w:p>
+      <w:r>
+        <w:t>            "</w:t>
+      </w:r>
+      <w:proofErr w:type="spellStart"/>
+      <w:proofErr w:type="gramStart"/>
+      <w:r>
+        <w:t>official</w:t>
+      </w:r>
+      <w:proofErr w:type="gramEnd"/>
+      <w:r>
+        <w:t>_cell</w:t>
+      </w:r>
+      <w:proofErr w:type="spellEnd"/>
+      <w:r>
+        <w:t>": "",</w:t>
+      </w:r>
+    </w:p>
+    <w:p>
+      <w:r>
+        <w:t>            "email": "",</w:t>
+      </w:r>
+    </w:p>
+    <w:p>
+      <w:r>
+        <w:t>            "</w:t>
+      </w:r>
+      <w:proofErr w:type="spellStart"/>
+      <w:proofErr w:type="gramStart"/>
+      <w:r>
+        <w:t>official</w:t>
+      </w:r>
+      <w:proofErr w:type="gramEnd"/>
+      <w:r>
+        <w:t>_email</w:t>
+      </w:r>
+      <w:proofErr w:type="spellEnd"/>
+      <w:r>
+        <w:t>": "",</w:t>
+      </w:r>
+    </w:p>
+    <w:p>
+      <w:r>
+        <w:t>            "picture</w:t>
+      </w:r>
+      <w:proofErr w:type="gramStart"/>
+      <w:r>
+        <w:t>": "</w:t>
+      </w:r>
+      <w:proofErr w:type="gramEnd"/>
+      <w:r>
+        <w:t>"</w:t>
+      </w:r>
+    </w:p>
+    <w:p>
+      <w:r>
+        <w:t>        },</w:t>
+      </w:r>
+    </w:p>
+    <w:p>
+      <w:r>
+        <w:t>        "tickets</w:t>
+      </w:r>
+      <w:proofErr w:type="gramStart"/>
+      <w:r>
+        <w:t>": {</w:t>
+      </w:r>
+      <w:proofErr w:type="gramEnd"/>
+    </w:p>
+    <w:p>
+      <w:r>
+        <w:t>            "total": 0,</w:t>
+      </w:r>
+    </w:p>
+    <w:p>
+      <w:r>
+        <w:t>            "open": 0,</w:t>
+      </w:r>
+    </w:p>
+    <w:p>
+      <w:r>
+        <w:lastRenderedPageBreak/>
+        <w:t>            "running": 0,</w:t>
+      </w:r>
+    </w:p>
+    <w:p>
+      <w:r>
+        <w:t>            "closed": 0</w:t>
+      </w:r>
+    </w:p>
+    <w:p>
+      <w:r>
+        <w:t>        }</w:t>
+      </w:r>
+    </w:p>
+    <w:p>
+      <w:r>
+        <w:t>    },</w:t>
+      </w:r>
+    </w:p>
+    <w:p>
+      <w:r>
+        <w:t>    "success": </w:t>
+      </w:r>
+      <w:r>
+        <w:rPr>
+          <w:b/>
+          <w:bCs/>
+        </w:rPr>
+        <w:t>true</w:t>
+      </w:r>
+    </w:p>
+    <w:p>
+      <w:r>
+        <w:t>}</w:t>
+      </w:r>
+    </w:p>
+    <w:p/>
+    <w:p/>
+    <w:p/>
+    <w:p>
+      <w:r>
+        <w:t>Post man result</w:t>
+      </w:r>
+    </w:p>
+    <w:p/>
+    <w:p>
+      <w:r>
+        <w:drawing>
+          <wp:inline distT="0" distB="0" distL="0" distR="0" wp14:anchorId="2407BD06" wp14:editId="1562539D">
+            <wp:extent cx="5943600" cy="3170555"/>
+            <wp:effectExtent l="0" t="0" r="0" b="0"/>
+            <wp:docPr id="1585234248" name="Picture 1"/>
+            <wp:cNvGraphicFramePr>
+              <a:graphicFrameLocks xmlns:a="http://schemas.openxmlformats.org/drawingml/2006/main" noChangeAspect="1"/>
+            </wp:cNvGraphicFramePr>
+            <a:graphic xmlns:a="http://schemas.openxmlformats.org/drawingml/2006/main">
+              <a:graphicData uri="http://schemas.openxmlformats.org/drawingml/2006/picture">
+                <pic:pic xmlns:pic="http://schemas.openxmlformats.org/drawingml/2006/picture">
+                  <pic:nvPicPr>
+                    <pic:cNvPr id="1585234248" name=""/>
+                    <pic:cNvPicPr/>
+                  </pic:nvPicPr>
+                  <pic:blipFill>
+                    <a:blip r:embed="rId6"/>
+                    <a:stretch>
+                      <a:fillRect/>
+                    </a:stretch>
+                  </pic:blipFill>
+                  <pic:spPr>
+                    <a:xfrm>
+                      <a:off x="0" y="0"/>
+                      <a:ext cx="5943600" cy="3170555"/>
+                    </a:xfrm>
+                    <a:prstGeom prst="rect">
+                      <a:avLst/>
+                    </a:prstGeom>
+                  </pic:spPr>
+                </pic:pic>
+              </a:graphicData>
+            </a:graphic>
+          </wp:inline>
+        </w:drawing>
+      </w:r>
+    </w:p>
+    <w:p/>
+    <w:p/>
+    <w:p/>
+    <w:p/>
+    <w:p/>
+    <w:p/>
+    <w:p>
+      <w:hyperlink r:id="rId7" w:history="1">
+        <w:r>
+          <w:rPr>
+            <w:rStyle w:val="Hyperlink"/>
+          </w:rPr>
+          <w:t>http://127.0.0.1:8080/api/v1/user/trouble-tickets?page=1&amp;limit=20</w:t>
+        </w:r>
+      </w:hyperlink>
+    </w:p>
+    <w:p>
+      <w:r>
+        <w:t>{</w:t>
+      </w:r>
+    </w:p>
+    <w:p>
+      <w:r>
+        <w:t>    "data": [],</w:t>
+      </w:r>
+    </w:p>
+    <w:p>
+      <w:r>
+        <w:t>    "page": 1,</w:t>
+      </w:r>
+    </w:p>
+    <w:p>
+      <w:r>
+        <w:t>    "</w:t>
+      </w:r>
+      <w:proofErr w:type="spellStart"/>
+      <w:proofErr w:type="gramStart"/>
+      <w:r>
+        <w:t>page</w:t>
+      </w:r>
+      <w:proofErr w:type="gramEnd"/>
+      <w:r>
+        <w:t>_size</w:t>
+      </w:r>
+      <w:proofErr w:type="spellEnd"/>
+      <w:r>
+        <w:t>": 20,</w:t>
+      </w:r>
+    </w:p>
+    <w:p>
+      <w:r>
+        <w:t>    "success": </w:t>
+      </w:r>
+      <w:r>
+        <w:rPr>
+          <w:b/>
+          <w:bCs/>
+        </w:rPr>
+        <w:t>true</w:t>
+      </w:r>
+      <w:r>
+        <w:t>,</w:t>
+      </w:r>
+    </w:p>
+    <w:p>
+      <w:r>
+        <w:t>    "total": 0</w:t>
+      </w:r>
+    </w:p>
+    <w:p>
+      <w:r>
+        <w:t>}</w:t>
+      </w:r>
+    </w:p>
+    <w:p/>
+    <w:p>
+      <w:r>
+        <w:drawing>
+          <wp:inline distT="0" distB="0" distL="0" distR="0" wp14:anchorId="1D0EC73E" wp14:editId="40D98E36">
+            <wp:extent cx="5943600" cy="3136265"/>
+            <wp:effectExtent l="0" t="0" r="0" b="6985"/>
+            <wp:docPr id="905349706" name="Picture 1"/>
+            <wp:cNvGraphicFramePr>
+              <a:graphicFrameLocks xmlns:a="http://schemas.openxmlformats.org/drawingml/2006/main" noChangeAspect="1"/>
+            </wp:cNvGraphicFramePr>
+            <a:graphic xmlns:a="http://schemas.openxmlformats.org/drawingml/2006/main">
+              <a:graphicData uri="http://schemas.openxmlformats.org/drawingml/2006/picture">
+                <pic:pic xmlns:pic="http://schemas.openxmlformats.org/drawingml/2006/picture">
+                  <pic:nvPicPr>
+                    <pic:cNvPr id="905349706" name=""/>
+                    <pic:cNvPicPr/>
+                  </pic:nvPicPr>
+                  <pic:blipFill>
+                    <a:blip r:embed="rId8"/>
+                    <a:stretch>
+                      <a:fillRect/>
+                    </a:stretch>
+                  </pic:blipFill>
+                  <pic:spPr>
+                    <a:xfrm>
+                      <a:off x="0" y="0"/>
+                      <a:ext cx="5943600" cy="3136265"/>
+                    </a:xfrm>
+                    <a:prstGeom prst="rect">
+                      <a:avLst/>
+                    </a:prstGeom>
+                  </pic:spPr>
+                </pic:pic>
+              </a:graphicData>
+            </a:graphic>
+          </wp:inline>
+        </w:drawing>
+      </w:r>
+    </w:p>
+    <w:p/>
+    <w:p/>
+    <w:p/>
+    <w:p/>
+    <w:p/>
+    <w:p/>
+    <w:p/>
+    <w:p>
+      <w:r>
+        <w:t>SELECT</w:t>
+      </w:r>
+    </w:p>
+    <w:p>
+      <w:r>
+        <w:t xml:space="preserve">    u.id,</w:t>
+      </w:r>
+    </w:p>
+    <w:p>
+      <w:r>
+        <w:t xml:space="preserve">    </w:t>
+      </w:r>
+      <w:proofErr w:type="spellStart"/>
+      <w:proofErr w:type="gramStart"/>
+      <w:r>
+        <w:t>u.username</w:t>
+      </w:r>
+      <w:proofErr w:type="spellEnd"/>
+      <w:proofErr w:type="gramEnd"/>
+      <w:r>
+        <w:t>,</w:t>
+      </w:r>
+    </w:p>
+    <w:p>
+      <w:r>
+        <w:t xml:space="preserve">    </w:t>
+      </w:r>
+      <w:proofErr w:type="spellStart"/>
+      <w:proofErr w:type="gramStart"/>
+      <w:r>
+        <w:t>u.employee</w:t>
+      </w:r>
+      <w:proofErr w:type="gramEnd"/>
+      <w:r>
+        <w:t>_id</w:t>
+      </w:r>
+      <w:proofErr w:type="spellEnd"/>
+      <w:r>
+        <w:t>,</w:t>
+      </w:r>
+    </w:p>
+    <w:p>
+      <w:r>
+        <w:t xml:space="preserve">    </w:t>
+      </w:r>
+      <w:proofErr w:type="spellStart"/>
+      <w:r>
+        <w:t>u.user_type</w:t>
+      </w:r>
+      <w:proofErr w:type="spellEnd"/>
+      <w:r>
+        <w:t>,</w:t>
+      </w:r>
+    </w:p>
+    <w:p>
+      <w:r>
+        <w:t xml:space="preserve">    </w:t>
+      </w:r>
+      <w:proofErr w:type="spellStart"/>
+      <w:proofErr w:type="gramStart"/>
+      <w:r>
+        <w:t>r.code</w:t>
+      </w:r>
+      <w:proofErr w:type="spellEnd"/>
+      <w:proofErr w:type="gramEnd"/>
+      <w:r>
+        <w:t xml:space="preserve"> AS </w:t>
+      </w:r>
+      <w:proofErr w:type="spellStart"/>
+      <w:r>
+        <w:t>role_code</w:t>
+      </w:r>
+      <w:proofErr w:type="spellEnd"/>
+      <w:r>
+        <w:t>,</w:t>
+      </w:r>
+    </w:p>
+    <w:p>
+      <w:r>
+        <w:t xml:space="preserve">    </w:t>
+      </w:r>
+      <w:proofErr w:type="spellStart"/>
+      <w:proofErr w:type="gramStart"/>
+      <w:r>
+        <w:t>p.code</w:t>
+      </w:r>
+      <w:proofErr w:type="spellEnd"/>
+      <w:proofErr w:type="gramEnd"/>
+      <w:r>
+        <w:t xml:space="preserve"> AS </w:t>
+      </w:r>
+      <w:proofErr w:type="spellStart"/>
+      <w:r>
+        <w:t>permission_code</w:t>
+      </w:r>
+      <w:proofErr w:type="spellEnd"/>
+    </w:p>
+    <w:p>
+      <w:r>
+        <w:t xml:space="preserve">FROM </w:t>
+      </w:r>
+      <w:proofErr w:type="spellStart"/>
+      <w:proofErr w:type="gramStart"/>
+      <w:r>
+        <w:t>public.users</w:t>
+      </w:r>
+      <w:proofErr w:type="spellEnd"/>
+      <w:proofErr w:type="gramEnd"/>
+      <w:r>
+        <w:t xml:space="preserve"> u</w:t>
+      </w:r>
+    </w:p>
+    <w:p>
+      <w:r>
+        <w:t xml:space="preserve">LEFT JOIN </w:t>
+      </w:r>
+      <w:proofErr w:type="spellStart"/>
+      <w:proofErr w:type="gramStart"/>
+      <w:r>
+        <w:t>public.auth</w:t>
+      </w:r>
+      <w:proofErr w:type="gramEnd"/>
+      <w:r>
+        <w:t>_user_roles</w:t>
+      </w:r>
+      <w:proofErr w:type="spellEnd"/>
+      <w:r>
+        <w:t xml:space="preserve"> </w:t>
+      </w:r>
+      <w:proofErr w:type="spellStart"/>
+      <w:r>
+        <w:t>ur</w:t>
+      </w:r>
+      <w:proofErr w:type="spellEnd"/>
+    </w:p>
+    <w:p>
+      <w:r>
+        <w:t xml:space="preserve">    ON </w:t>
+      </w:r>
+      <w:proofErr w:type="spellStart"/>
+      <w:r>
+        <w:t>ur.user_id</w:t>
+      </w:r>
+      <w:proofErr w:type="spellEnd"/>
+      <w:r>
+        <w:t xml:space="preserve"> = u.id</w:t>
+      </w:r>
+    </w:p>
+    <w:p>
+      <w:r>
+        <w:t xml:space="preserve">LEFT JOIN </w:t>
+      </w:r>
+      <w:proofErr w:type="spellStart"/>
+      <w:proofErr w:type="gramStart"/>
+      <w:r>
+        <w:t>public.auth</w:t>
+      </w:r>
+      <w:proofErr w:type="gramEnd"/>
+      <w:r>
+        <w:t>_roles</w:t>
+      </w:r>
+      <w:proofErr w:type="spellEnd"/>
+      <w:r>
+        <w:t xml:space="preserve"> r</w:t>
+      </w:r>
+    </w:p>
+    <w:p>
+      <w:r>
+        <w:t xml:space="preserve">    ON r.id = </w:t>
+      </w:r>
+      <w:proofErr w:type="spellStart"/>
+      <w:proofErr w:type="gramStart"/>
+      <w:r>
+        <w:t>ur.role</w:t>
+      </w:r>
+      <w:proofErr w:type="gramEnd"/>
+      <w:r>
+        <w:t>_id</w:t>
+      </w:r>
+      <w:proofErr w:type="spellEnd"/>
+    </w:p>
+    <w:p>
+      <w:r>
+        <w:t xml:space="preserve">LEFT JOIN </w:t>
+      </w:r>
+      <w:proofErr w:type="spellStart"/>
+      <w:proofErr w:type="gramStart"/>
+      <w:r>
+        <w:t>public.auth</w:t>
+      </w:r>
+      <w:proofErr w:type="gramEnd"/>
+      <w:r>
+        <w:t>_role_permissions</w:t>
+      </w:r>
+      <w:proofErr w:type="spellEnd"/>
+      <w:r>
+        <w:t xml:space="preserve"> </w:t>
+      </w:r>
+      <w:proofErr w:type="spellStart"/>
+      <w:r>
+        <w:t>rp</w:t>
+      </w:r>
+      <w:proofErr w:type="spellEnd"/>
+    </w:p>
+    <w:p>
+      <w:r>
+        <w:t xml:space="preserve">    ON </w:t>
+      </w:r>
+      <w:proofErr w:type="spellStart"/>
+      <w:proofErr w:type="gramStart"/>
+      <w:r>
+        <w:t>rp.role</w:t>
+      </w:r>
+      <w:proofErr w:type="gramEnd"/>
+      <w:r>
+        <w:t>_id</w:t>
+      </w:r>
+      <w:proofErr w:type="spellEnd"/>
+      <w:r>
+        <w:t xml:space="preserve"> = r.id</w:t>
+      </w:r>
+    </w:p>
+    <w:p>
+      <w:r>
+        <w:t xml:space="preserve">LEFT JOIN </w:t>
+      </w:r>
+      <w:proofErr w:type="spellStart"/>
+      <w:proofErr w:type="gramStart"/>
+      <w:r>
+        <w:t>public.auth</w:t>
+      </w:r>
+      <w:proofErr w:type="gramEnd"/>
+      <w:r>
+        <w:t>_permissions</w:t>
+      </w:r>
+      <w:proofErr w:type="spellEnd"/>
+      <w:r>
+        <w:t xml:space="preserve"> p</w:t>
+      </w:r>
+    </w:p>
+    <w:p>
+      <w:r>
+        <w:t xml:space="preserve">    ON p.id = </w:t>
+      </w:r>
+      <w:proofErr w:type="spellStart"/>
+      <w:proofErr w:type="gramStart"/>
+      <w:r>
+        <w:t>rp.permission</w:t>
+      </w:r>
+      <w:proofErr w:type="gramEnd"/>
+      <w:r>
+        <w:t>_id</w:t>
+      </w:r>
+      <w:proofErr w:type="spellEnd"/>
+    </w:p>
+    <w:p>
+      <w:r>
+        <w:t xml:space="preserve">WHERE </w:t>
+      </w:r>
+      <w:proofErr w:type="spellStart"/>
+      <w:proofErr w:type="gramStart"/>
+      <w:r>
+        <w:t>u.username</w:t>
+      </w:r>
+      <w:proofErr w:type="spellEnd"/>
+      <w:proofErr w:type="gramEnd"/>
+      <w:r>
+        <w:t xml:space="preserve"> = '</w:t>
+      </w:r>
+      <w:proofErr w:type="spellStart"/>
+      <w:proofErr w:type="gramStart"/>
+      <w:r>
+        <w:t>test.general</w:t>
+      </w:r>
+      <w:proofErr w:type="spellEnd"/>
+      <w:proofErr w:type="gramEnd"/>
+      <w:r>
+        <w:t>'</w:t>
+      </w:r>
+    </w:p>
+    <w:p>
+      <w:r>
+        <w:t xml:space="preserve">ORDER BY </w:t>
+      </w:r>
+      <w:proofErr w:type="spellStart"/>
+      <w:proofErr w:type="gramStart"/>
+      <w:r>
+        <w:t>p.code</w:t>
+      </w:r>
+      <w:proofErr w:type="spellEnd"/>
+      <w:proofErr w:type="gramEnd"/>
+      <w:r>
+        <w:t>;</w:t>
+      </w:r>
+    </w:p>
+    <w:p/>
+    <w:p/>
+    <w:p/>
+    <w:p/>
+    <w:p/>
+    <w:p/>
+    <w:p/>
+    <w:p>
+      <w:pPr>
+        <w:rPr>
+          <w:b/>
+          <w:bCs/>
+        </w:rPr>
+      </w:pPr>
+      <w:r>
+        <w:rPr>
+          <w:b/>
+          <w:bCs/>
+        </w:rPr>
+        <w:t>Expected:</w:t>
+      </w:r>
+    </w:p>
+    <w:p>
+      <w:r>
+        <w:t xml:space="preserve">username         </w:t>
+      </w:r>
+      <w:r>
+        <w:t xml:space="preserve">       </w:t>
+      </w:r>
+      <w:proofErr w:type="spellStart"/>
+      <w:proofErr w:type="gramStart"/>
+      <w:r>
+        <w:t>test.general</w:t>
+      </w:r>
+      <w:proofErr w:type="spellEnd"/>
+      <w:proofErr w:type="gramEnd"/>
+    </w:p>
+    <w:p>
+      <w:proofErr w:type="spellStart"/>
+      <w:r>
+        <w:t>employee_id</w:t>
+      </w:r>
+      <w:proofErr w:type="spellEnd"/>
+      <w:r>
+        <w:t xml:space="preserve">      </w:t>
+      </w:r>
+      <w:r>
+        <w:t xml:space="preserve">    </w:t>
+      </w:r>
+      <w:r>
+        <w:t>TEST-GEN-001</w:t>
+      </w:r>
+    </w:p>
+    <w:p>
+      <w:proofErr w:type="spellStart"/>
+      <w:r>
+        <w:t>user_type</w:t>
+      </w:r>
+      <w:proofErr w:type="spellEnd"/>
+      <w:r>
+        <w:t xml:space="preserve">        </w:t>
+      </w:r>
+      <w:r>
+        <w:t xml:space="preserve">        </w:t>
+      </w:r>
+      <w:r>
+        <w:t>3</w:t>
+      </w:r>
+    </w:p>
+    <w:p>
+      <w:proofErr w:type="spellStart"/>
+      <w:r>
+        <w:t>role_code</w:t>
+      </w:r>
+      <w:proofErr w:type="spellEnd"/>
+      <w:r>
+        <w:t xml:space="preserve">        </w:t>
+      </w:r>
+      <w:r>
+        <w:t xml:space="preserve">        </w:t>
+      </w:r>
+      <w:r>
+        <w:t>GENERAL_USER</w:t>
+      </w:r>
+    </w:p>
+    <w:p>
+      <w:proofErr w:type="spellStart"/>
+      <w:r>
+        <w:t>permission_code</w:t>
+      </w:r>
+      <w:proofErr w:type="spellEnd"/>
+      <w:r>
+        <w:t xml:space="preserve">  </w:t>
+      </w:r>
+      <w:r>
+        <w:t xml:space="preserve"> </w:t>
+      </w:r>
+      <w:proofErr w:type="spellStart"/>
+      <w:proofErr w:type="gramStart"/>
+      <w:r>
+        <w:t>dashboard.self</w:t>
+      </w:r>
+      <w:proofErr w:type="gramEnd"/>
+      <w:r>
+        <w:t>.access</w:t>
+      </w:r>
+      <w:proofErr w:type="spellEnd"/>
+    </w:p>
+    <w:p/>
+    <w:p/>
+    <w:p>
+      <w:pPr>
+        <w:rPr>
+          <w:b/>
+          <w:bCs/>
+        </w:rPr>
+      </w:pPr>
+      <w:r>
+        <w:rPr>
+          <w:b/>
+          <w:bCs/>
+        </w:rPr>
+        <w:t>Step 4 — Verify</w:t>
+      </w:r>
+    </w:p>
+    <w:p>
+      <w:r>
+        <w:t>Run:</w:t>
+      </w:r>
+    </w:p>
+    <w:p>
+      <w:r>
+        <w:t>SELECT</w:t>
+      </w:r>
+    </w:p>
+    <w:p>
+      <w:r>
+        <w:t xml:space="preserve">    id,</w:t>
+      </w:r>
+    </w:p>
+    <w:p>
+      <w:r>
+        <w:t xml:space="preserve">    username,</w:t>
+      </w:r>
+    </w:p>
+    <w:p>
+      <w:r>
+        <w:t xml:space="preserve">    </w:t>
+      </w:r>
+      <w:proofErr w:type="spellStart"/>
+      <w:r>
+        <w:t>employee_id</w:t>
+      </w:r>
+      <w:proofErr w:type="spellEnd"/>
+      <w:r>
+        <w:t>,</w:t>
+      </w:r>
+    </w:p>
+    <w:p>
+      <w:r>
+        <w:t xml:space="preserve">    </w:t>
+      </w:r>
+      <w:proofErr w:type="spellStart"/>
+      <w:r>
+        <w:t>full_name</w:t>
+      </w:r>
+      <w:proofErr w:type="spellEnd"/>
+      <w:r>
+        <w:t>,</w:t>
+      </w:r>
+    </w:p>
+    <w:p>
+      <w:r>
+        <w:t xml:space="preserve">    </w:t>
+      </w:r>
+      <w:proofErr w:type="spellStart"/>
+      <w:r>
+        <w:t>user_type</w:t>
+      </w:r>
+      <w:proofErr w:type="spellEnd"/>
+      <w:r>
+        <w:t>,</w:t>
+      </w:r>
+    </w:p>
+    <w:p>
+      <w:r>
+        <w:t xml:space="preserve">    </w:t>
+      </w:r>
+      <w:proofErr w:type="spellStart"/>
+      <w:r>
+        <w:t>account_status</w:t>
+      </w:r>
+      <w:proofErr w:type="spellEnd"/>
+    </w:p>
+    <w:p>
+      <w:r>
+        <w:t xml:space="preserve">FROM </w:t>
+      </w:r>
+      <w:proofErr w:type="spellStart"/>
+      <w:proofErr w:type="gramStart"/>
+      <w:r>
+        <w:t>public.users</w:t>
+      </w:r>
+      <w:proofErr w:type="spellEnd"/>
+      <w:proofErr w:type="gramEnd"/>
+    </w:p>
+    <w:p>
+      <w:r>
+        <w:t>WHERE username = '</w:t>
+      </w:r>
+      <w:proofErr w:type="spellStart"/>
+      <w:proofErr w:type="gramStart"/>
+      <w:r>
+        <w:t>test.general</w:t>
+      </w:r>
+      <w:proofErr w:type="spellEnd"/>
+      <w:proofErr w:type="gramEnd"/>
+      <w:r>
+        <w:t>';</w:t>
+      </w:r>
+    </w:p>
+    <w:p>
+      <w:pPr>
+        <w:rPr>
+          <w:b/>
+          <w:bCs/>
+        </w:rPr>
+      </w:pPr>
+      <w:r>
+        <w:rPr>
+          <w:b/>
+          <w:bCs/>
+        </w:rPr>
+        <w:t>Expected:</w:t>
+      </w:r>
+    </w:p>
+    <w:p>
+      <w:r>
+        <w:t xml:space="preserve">username      </w:t>
+      </w:r>
+      <w:proofErr w:type="spellStart"/>
+      <w:proofErr w:type="gramStart"/>
+      <w:r>
+        <w:t>test.general</w:t>
+      </w:r>
+      <w:proofErr w:type="spellEnd"/>
+      <w:proofErr w:type="gramEnd"/>
+    </w:p>
+    <w:p>
+      <w:proofErr w:type="spellStart"/>
+      <w:r>
+        <w:t>employee_id</w:t>
+      </w:r>
+      <w:proofErr w:type="spellEnd"/>
+      <w:r>
+        <w:t xml:space="preserve">   02-0908</w:t>
+      </w:r>
+    </w:p>
+    <w:p>
+      <w:proofErr w:type="spellStart"/>
+      <w:r>
+        <w:t>user_type</w:t>
+      </w:r>
+      <w:proofErr w:type="spellEnd"/>
+      <w:r>
+        <w:t xml:space="preserve">     3</w:t>
+      </w:r>
+    </w:p>
+    <w:p/>
+    <w:p/>
+    <w:p/>
+    <w:p>
+      <w:proofErr w:type="gramStart"/>
+      <w:r>
+        <w:t>Method :</w:t>
+      </w:r>
+      <w:proofErr w:type="gramEnd"/>
+      <w:r>
+        <w:t xml:space="preserve"> GET</w:t>
+      </w:r>
+    </w:p>
+    <w:p/>
+    <w:p>
+      <w:hyperlink r:id="rId9" w:history="1">
+        <w:r>
+          <w:rPr>
+            <w:rStyle w:val="Hyperlink"/>
+          </w:rPr>
+          <w:t>http://127.0.0.1:8080/api/v1/auth/me</w:t>
+        </w:r>
+      </w:hyperlink>
+    </w:p>
+    <w:p/>
+    <w:p>
+      <w:r>
+        <w:t>{</w:t>
+      </w:r>
+    </w:p>
+    <w:p>
+      <w:r>
+        <w:t>    "data</w:t>
+      </w:r>
+      <w:proofErr w:type="gramStart"/>
+      <w:r>
+        <w:t>": {</w:t>
+      </w:r>
+      <w:proofErr w:type="gramEnd"/>
+    </w:p>
+    <w:p>
+      <w:r>
+        <w:t>        "</w:t>
+      </w:r>
+      <w:proofErr w:type="spellStart"/>
+      <w:proofErr w:type="gramStart"/>
+      <w:r>
+        <w:t>account</w:t>
+      </w:r>
+      <w:proofErr w:type="gramEnd"/>
+      <w:r>
+        <w:t>_status</w:t>
+      </w:r>
+      <w:proofErr w:type="spellEnd"/>
+      <w:r>
+        <w:t>": "active",</w:t>
+      </w:r>
+    </w:p>
+    <w:p>
+      <w:r>
+        <w:t>        "email": "</w:t>
+      </w:r>
+      <w:proofErr w:type="spellStart"/>
+      <w:r>
+        <w:t>test.general@itm.local</w:t>
+      </w:r>
+      <w:proofErr w:type="spellEnd"/>
+      <w:r>
+        <w:t>",</w:t>
+      </w:r>
+    </w:p>
+    <w:p>
+      <w:r>
+        <w:t>        "</w:t>
+      </w:r>
+      <w:proofErr w:type="spellStart"/>
+      <w:proofErr w:type="gramStart"/>
+      <w:r>
+        <w:t>employee</w:t>
+      </w:r>
+      <w:proofErr w:type="gramEnd"/>
+      <w:r>
+        <w:t>_id</w:t>
+      </w:r>
+      <w:proofErr w:type="spellEnd"/>
+      <w:r>
+        <w:t>": "02-0908",</w:t>
+      </w:r>
+    </w:p>
+    <w:p>
+      <w:r>
+        <w:t>        "</w:t>
+      </w:r>
+      <w:proofErr w:type="spellStart"/>
+      <w:proofErr w:type="gramStart"/>
+      <w:r>
+        <w:t>full</w:t>
+      </w:r>
+      <w:proofErr w:type="gramEnd"/>
+      <w:r>
+        <w:t>_name</w:t>
+      </w:r>
+      <w:proofErr w:type="spellEnd"/>
+      <w:r>
+        <w:t>": "Test General User",</w:t>
+      </w:r>
+    </w:p>
+    <w:p>
+      <w:r>
+        <w:t>        "</w:t>
+      </w:r>
+      <w:proofErr w:type="spellStart"/>
+      <w:proofErr w:type="gramStart"/>
+      <w:r>
+        <w:t>must</w:t>
+      </w:r>
+      <w:proofErr w:type="gramEnd"/>
+      <w:r>
+        <w:t>_change_password</w:t>
+      </w:r>
+      <w:proofErr w:type="spellEnd"/>
+      <w:r>
+        <w:t>": </w:t>
+      </w:r>
+      <w:r>
+        <w:rPr>
+          <w:b/>
+          <w:bCs/>
+        </w:rPr>
+        <w:t>true</w:t>
+      </w:r>
+      <w:r>
+        <w:t>,</w:t>
+      </w:r>
+    </w:p>
+    <w:p>
+      <w:r>
+        <w:t>        "permissions": [</w:t>
+      </w:r>
+    </w:p>
+    <w:p>
+      <w:r>
+        <w:t>            "</w:t>
+      </w:r>
+      <w:proofErr w:type="spellStart"/>
+      <w:proofErr w:type="gramStart"/>
+      <w:r>
+        <w:t>dashboard.self</w:t>
+      </w:r>
+      <w:proofErr w:type="gramEnd"/>
+      <w:r>
+        <w:t>.access</w:t>
+      </w:r>
+      <w:proofErr w:type="spellEnd"/>
+      <w:r>
+        <w:t>"</w:t>
+      </w:r>
+    </w:p>
+    <w:p>
+      <w:r>
+        <w:t>        ],</w:t>
+      </w:r>
+    </w:p>
+    <w:p>
+      <w:r>
+        <w:t>        "</w:t>
+      </w:r>
+      <w:proofErr w:type="spellStart"/>
+      <w:proofErr w:type="gramStart"/>
+      <w:r>
+        <w:t>role</w:t>
+      </w:r>
+      <w:proofErr w:type="gramEnd"/>
+      <w:r>
+        <w:t>_code</w:t>
+      </w:r>
+      <w:proofErr w:type="spellEnd"/>
+      <w:r>
+        <w:t>": "GENERAL_USER",</w:t>
+      </w:r>
+    </w:p>
+    <w:p>
+      <w:r>
+        <w:t>        "</w:t>
+      </w:r>
+      <w:proofErr w:type="spellStart"/>
+      <w:proofErr w:type="gramStart"/>
+      <w:r>
+        <w:t>role</w:t>
+      </w:r>
+      <w:proofErr w:type="gramEnd"/>
+      <w:r>
+        <w:t>_name</w:t>
+      </w:r>
+      <w:proofErr w:type="spellEnd"/>
+      <w:r>
+        <w:t>": "General User",</w:t>
+      </w:r>
+    </w:p>
+    <w:p>
+      <w:r>
+        <w:t>        "</w:t>
+      </w:r>
+      <w:proofErr w:type="spellStart"/>
+      <w:proofErr w:type="gramStart"/>
+      <w:r>
+        <w:t>user</w:t>
+      </w:r>
+      <w:proofErr w:type="gramEnd"/>
+      <w:r>
+        <w:t>_id</w:t>
+      </w:r>
+      <w:proofErr w:type="spellEnd"/>
+      <w:r>
+        <w:t>": 4,</w:t>
+      </w:r>
+    </w:p>
+    <w:p>
+      <w:r>
+        <w:t>        "</w:t>
+      </w:r>
+      <w:proofErr w:type="spellStart"/>
+      <w:proofErr w:type="gramStart"/>
+      <w:r>
+        <w:t>user</w:t>
+      </w:r>
+      <w:proofErr w:type="gramEnd"/>
+      <w:r>
+        <w:t>_type</w:t>
+      </w:r>
+      <w:proofErr w:type="spellEnd"/>
+      <w:r>
+        <w:t>": 3,</w:t>
+      </w:r>
+    </w:p>
+    <w:p>
+      <w:r>
+        <w:t>        "username": "</w:t>
+      </w:r>
+      <w:proofErr w:type="spellStart"/>
+      <w:proofErr w:type="gramStart"/>
+      <w:r>
+        <w:t>test.general</w:t>
+      </w:r>
+      <w:proofErr w:type="spellEnd"/>
+      <w:proofErr w:type="gramEnd"/>
+      <w:r>
+        <w:t>"</w:t>
+      </w:r>
+    </w:p>
+    <w:p>
+      <w:r>
+        <w:t>    },</w:t>
+      </w:r>
+    </w:p>
+    <w:p>
+      <w:r>
+        <w:t>    "success": </w:t>
+      </w:r>
+      <w:r>
+        <w:rPr>
+          <w:b/>
+          <w:bCs/>
+        </w:rPr>
+        <w:t>true</w:t>
+      </w:r>
+    </w:p>
+    <w:p>
+      <w:r>
+        <w:t>}</w:t>
+      </w:r>
+    </w:p>
+    <w:p/>
+    <w:p/>
+    <w:p/>
+    <w:p/>
+    <w:p>
+      <w:hyperlink r:id="rId10" w:history="1">
+        <w:r>
+          <w:rPr>
+            <w:rStyle w:val="Hyperlink"/>
+          </w:rPr>
+          <w:t>http://127.0.0.1:8080/api/v1/user/dashboard</w:t>
+        </w:r>
+      </w:hyperlink>
+    </w:p>
+    <w:p/>
+    <w:p>
+      <w:r>
+        <w:t>{</w:t>
+      </w:r>
+    </w:p>
+    <w:p>
+      <w:r>
+        <w:t>    "data</w:t>
+      </w:r>
+      <w:proofErr w:type="gramStart"/>
+      <w:r>
+        <w:t>": {</w:t>
+      </w:r>
+      <w:proofErr w:type="gramEnd"/>
+    </w:p>
+    <w:p>
+      <w:r>
+        <w:t>        "employee</w:t>
+      </w:r>
+      <w:proofErr w:type="gramStart"/>
+      <w:r>
+        <w:t>": {</w:t>
+      </w:r>
+      <w:proofErr w:type="gramEnd"/>
+    </w:p>
+    <w:p>
+      <w:r>
+        <w:t>            "</w:t>
+      </w:r>
+      <w:proofErr w:type="spellStart"/>
+      <w:proofErr w:type="gramStart"/>
+      <w:r>
+        <w:t>employee</w:t>
+      </w:r>
+      <w:proofErr w:type="gramEnd"/>
+      <w:r>
+        <w:t>_id</w:t>
+      </w:r>
+      <w:proofErr w:type="spellEnd"/>
+      <w:r>
+        <w:t>": "02-0908",</w:t>
+      </w:r>
+    </w:p>
+    <w:p>
+      <w:r>
+        <w:t>            "</w:t>
+      </w:r>
+      <w:proofErr w:type="spellStart"/>
+      <w:proofErr w:type="gramStart"/>
+      <w:r>
+        <w:t>employee</w:t>
+      </w:r>
+      <w:proofErr w:type="gramEnd"/>
+      <w:r>
+        <w:t>_name</w:t>
+      </w:r>
+      <w:proofErr w:type="spellEnd"/>
+      <w:r>
+        <w:t>": "Md. </w:t>
+      </w:r>
+      <w:proofErr w:type="spellStart"/>
+      <w:r>
+        <w:t>Asraful</w:t>
+      </w:r>
+      <w:proofErr w:type="spellEnd"/>
+      <w:r>
+        <w:t> Islam",</w:t>
+      </w:r>
+    </w:p>
+    <w:p>
+      <w:r>
+        <w:t>            "designation": "Senior Engineer",</w:t>
+      </w:r>
+    </w:p>
+    <w:p>
+      <w:r>
+        <w:t>            "department": "Technology",</w:t>
+      </w:r>
+    </w:p>
+    <w:p>
+      <w:r>
+        <w:t>            "</w:t>
+      </w:r>
+      <w:proofErr w:type="spellStart"/>
+      <w:proofErr w:type="gramStart"/>
+      <w:r>
+        <w:t>work</w:t>
+      </w:r>
+      <w:proofErr w:type="gramEnd"/>
+      <w:r>
+        <w:t>_field</w:t>
+      </w:r>
+      <w:proofErr w:type="spellEnd"/>
+      <w:r>
+        <w:t>": "IT",</w:t>
+      </w:r>
+    </w:p>
+    <w:p>
+      <w:r>
+        <w:t>            "</w:t>
+      </w:r>
+      <w:proofErr w:type="spellStart"/>
+      <w:proofErr w:type="gramStart"/>
+      <w:r>
+        <w:t>sub</w:t>
+      </w:r>
+      <w:proofErr w:type="gramEnd"/>
+      <w:r>
+        <w:t>_function</w:t>
+      </w:r>
+      <w:proofErr w:type="spellEnd"/>
+      <w:r>
+        <w:t>": "",</w:t>
+      </w:r>
+    </w:p>
+    <w:p>
+      <w:r>
+        <w:t>            "active": "No",</w:t>
+      </w:r>
+    </w:p>
+    <w:p>
+      <w:r>
+        <w:t>            "</w:t>
+      </w:r>
+      <w:proofErr w:type="spellStart"/>
+      <w:proofErr w:type="gramStart"/>
+      <w:r>
+        <w:t>personal</w:t>
+      </w:r>
+      <w:proofErr w:type="gramEnd"/>
+      <w:r>
+        <w:t>_cell</w:t>
+      </w:r>
+      <w:proofErr w:type="spellEnd"/>
+      <w:r>
+        <w:t>": "01625330747",</w:t>
+      </w:r>
+    </w:p>
+    <w:p>
+      <w:r>
+        <w:t>            "</w:t>
+      </w:r>
+      <w:proofErr w:type="spellStart"/>
+      <w:proofErr w:type="gramStart"/>
+      <w:r>
+        <w:t>official</w:t>
+      </w:r>
+      <w:proofErr w:type="gramEnd"/>
+      <w:r>
+        <w:t>_cell</w:t>
+      </w:r>
+      <w:proofErr w:type="spellEnd"/>
+      <w:r>
+        <w:t>": "01847102319",</w:t>
+      </w:r>
+    </w:p>
+    <w:p>
+      <w:r>
+        <w:t>            "email": "",</w:t>
+      </w:r>
+    </w:p>
+    <w:p>
+      <w:r>
+        <w:t>            "</w:t>
+      </w:r>
+      <w:proofErr w:type="spellStart"/>
+      <w:proofErr w:type="gramStart"/>
+      <w:r>
+        <w:t>official</w:t>
+      </w:r>
+      <w:proofErr w:type="gramEnd"/>
+      <w:r>
+        <w:t>_email</w:t>
+      </w:r>
+      <w:proofErr w:type="spellEnd"/>
+      <w:r>
+        <w:t>": "asraful.islam@fiberathome.net",</w:t>
+      </w:r>
+    </w:p>
+    <w:p>
+      <w:r>
+        <w:t>            "picture": "</w:t>
+      </w:r>
+      <w:proofErr w:type="spellStart"/>
+      <w:r>
+        <w:t>user_images</w:t>
+      </w:r>
+      <w:proofErr w:type="spellEnd"/>
+      <w:r>
+        <w:t>/1456827309.jpg"</w:t>
+      </w:r>
+    </w:p>
+    <w:p>
+      <w:r>
+        <w:t>        },</w:t>
+      </w:r>
+    </w:p>
+    <w:p>
+      <w:r>
+        <w:t>        "tickets</w:t>
+      </w:r>
+      <w:proofErr w:type="gramStart"/>
+      <w:r>
+        <w:t>": {</w:t>
+      </w:r>
+      <w:proofErr w:type="gramEnd"/>
+    </w:p>
+    <w:p>
+      <w:r>
+        <w:t>            "total": 1045,</w:t>
+      </w:r>
+    </w:p>
+    <w:p>
+      <w:r>
+        <w:t>            "open": 0,</w:t>
+      </w:r>
+    </w:p>
+    <w:p>
+      <w:r>
+        <w:t>            "running": 0,</w:t>
+      </w:r>
+    </w:p>
+    <w:p>
+      <w:r>
+        <w:t>            "closed": 1045</w:t>
+      </w:r>
+    </w:p>
+    <w:p>
+      <w:r>
+        <w:t>        }</w:t>
+      </w:r>
+    </w:p>
+    <w:p>
+      <w:r>
+        <w:t>    },</w:t>
+      </w:r>
+    </w:p>
+    <w:p>
+      <w:r>
+        <w:lastRenderedPageBreak/>
+        <w:t>    "success": </w:t>
+      </w:r>
+      <w:r>
+        <w:rPr>
+          <w:b/>
+          <w:bCs/>
+        </w:rPr>
+        <w:t>true</w:t>
+      </w:r>
+    </w:p>
+    <w:p>
+      <w:r>
+        <w:t>}</w:t>
+      </w:r>
+    </w:p>
+    <w:p/>
+    <w:p/>
+    <w:p>
+      <w:r>
+        <w:t xml:space="preserve">Good — the backend is now returning </w:t>
+      </w:r>
+      <w:r>
+        <w:rPr>
+          <w:b/>
+          <w:bCs/>
+        </w:rPr>
+        <w:t>real employee data correctly</w:t>
+      </w:r>
+      <w:r>
+        <w:t xml:space="preserve"> for 02-0908, and </w:t>
+      </w:r>
+      <w:proofErr w:type="spellStart"/>
+      <w:proofErr w:type="gramStart"/>
+      <w:r>
+        <w:t>dashboard.self</w:t>
+      </w:r>
+      <w:proofErr w:type="gramEnd"/>
+      <w:r>
+        <w:t>.access</w:t>
+      </w:r>
+      <w:proofErr w:type="spellEnd"/>
+      <w:r>
+        <w:t xml:space="preserve"> is working exactly as intended.</w:t>
+      </w:r>
+    </w:p>
+    <w:p>
+      <w:r>
+        <w:t>Your flow is now confirmed:</w:t>
+      </w:r>
+    </w:p>
+    <w:p>
+      <w:proofErr w:type="spellStart"/>
+      <w:proofErr w:type="gramStart"/>
+      <w:r>
+        <w:t>test.general</w:t>
+      </w:r>
+      <w:proofErr w:type="spellEnd"/>
+      <w:proofErr w:type="gramEnd"/>
+    </w:p>
+    <w:p>
+      <w:r>
+        <w:t xml:space="preserve">    ↓</w:t>
+      </w:r>
+    </w:p>
+    <w:p>
+      <w:proofErr w:type="spellStart"/>
+      <w:r>
+        <w:t>employee_id</w:t>
+      </w:r>
+      <w:proofErr w:type="spellEnd"/>
+      <w:r>
+        <w:t xml:space="preserve"> = 02-0908</w:t>
+      </w:r>
+    </w:p>
+    <w:p>
+      <w:r>
+        <w:t xml:space="preserve">    ↓</w:t>
+      </w:r>
+    </w:p>
+    <w:p>
+      <w:r>
+        <w:t>GENERAL_USER</w:t>
+      </w:r>
+    </w:p>
+    <w:p>
+      <w:r>
+        <w:t xml:space="preserve">    ↓</w:t>
+      </w:r>
+    </w:p>
+    <w:p>
+      <w:proofErr w:type="spellStart"/>
+      <w:proofErr w:type="gramStart"/>
+      <w:r>
+        <w:t>dashboard.self</w:t>
+      </w:r>
+      <w:proofErr w:type="gramEnd"/>
+      <w:r>
+        <w:t>.access</w:t>
+      </w:r>
+      <w:proofErr w:type="spellEnd"/>
+    </w:p>
+    <w:p>
+      <w:r>
+        <w:t xml:space="preserve">    ↓</w:t>
+      </w:r>
+    </w:p>
+    <w:p>
+      <w:r>
+        <w:t>/user/dashboard</w:t>
+      </w:r>
+    </w:p>
+    <w:p>
+      <w:r>
+        <w:t xml:space="preserve">    ↓</w:t>
+      </w:r>
+    </w:p>
+    <w:p>
+      <w:r>
+        <w:t xml:space="preserve">Md. </w:t>
+      </w:r>
+      <w:proofErr w:type="spellStart"/>
+      <w:r>
+        <w:t>Asraful</w:t>
+      </w:r>
+      <w:proofErr w:type="spellEnd"/>
+      <w:r>
+        <w:t xml:space="preserve"> Islam</w:t>
+      </w:r>
+    </w:p>
+    <w:p>
+      <w:r>
+        <w:t>Technology</w:t>
+      </w:r>
+    </w:p>
+    <w:p>
+      <w:r>
+        <w:t>Senior Engineer</w:t>
+      </w:r>
+    </w:p>
+    <w:p>
+      <w:r>
+        <w:t>1045 tickets</w:t>
+      </w:r>
+    </w:p>
+    <w:p/>
+    <w:p/>
+    <w:p/>
+    <w:p/>
+    <w:p/>
+    <w:p/>
+    <w:p>
+      <w:proofErr w:type="gramStart"/>
+      <w:r>
+        <w:t>Method :</w:t>
+      </w:r>
+      <w:proofErr w:type="gramEnd"/>
+      <w:r>
+        <w:t xml:space="preserve"> GET</w:t>
+      </w:r>
+    </w:p>
+    <w:p>
+      <w:hyperlink r:id="rId11" w:history="1">
+        <w:r>
+          <w:rPr>
+            <w:rStyle w:val="Hyperlink"/>
+          </w:rPr>
+          <w:t>http://127.0.0.1:8080/api/v1/user/dashboard</w:t>
+        </w:r>
+      </w:hyperlink>
+    </w:p>
+    <w:p/>
+    <w:p>
+      <w:r>
+        <w:t>{</w:t>
+      </w:r>
+    </w:p>
+    <w:p>
+      <w:r>
+        <w:t>    "data</w:t>
+      </w:r>
+      <w:proofErr w:type="gramStart"/>
+      <w:r>
+        <w:t>": {</w:t>
+      </w:r>
+      <w:proofErr w:type="gramEnd"/>
+    </w:p>
+    <w:p>
+      <w:r>
+        <w:t>        "employee</w:t>
+      </w:r>
+      <w:proofErr w:type="gramStart"/>
+      <w:r>
+        <w:t>": {</w:t>
+      </w:r>
+      <w:proofErr w:type="gramEnd"/>
+    </w:p>
+    <w:p>
+      <w:r>
+        <w:t>            "</w:t>
+      </w:r>
+      <w:proofErr w:type="spellStart"/>
+      <w:proofErr w:type="gramStart"/>
+      <w:r>
+        <w:t>employee</w:t>
+      </w:r>
+      <w:proofErr w:type="gramEnd"/>
+      <w:r>
+        <w:t>_id</w:t>
+      </w:r>
+      <w:proofErr w:type="spellEnd"/>
+      <w:r>
+        <w:t>": "ADMIN-001",</w:t>
+      </w:r>
+    </w:p>
+    <w:p>
+      <w:r>
+        <w:t>            "</w:t>
+      </w:r>
+      <w:proofErr w:type="spellStart"/>
+      <w:proofErr w:type="gramStart"/>
+      <w:r>
+        <w:t>employee</w:t>
+      </w:r>
+      <w:proofErr w:type="gramEnd"/>
+      <w:r>
+        <w:t>_name</w:t>
+      </w:r>
+      <w:proofErr w:type="spellEnd"/>
+      <w:r>
+        <w:t>": "",</w:t>
+      </w:r>
+    </w:p>
+    <w:p>
+      <w:r>
+        <w:t>            "designation": "",</w:t>
+      </w:r>
+    </w:p>
+    <w:p>
+      <w:r>
+        <w:t>            "department": "",</w:t>
+      </w:r>
+    </w:p>
+    <w:p>
+      <w:r>
+        <w:t>            "</w:t>
+      </w:r>
+      <w:proofErr w:type="spellStart"/>
+      <w:proofErr w:type="gramStart"/>
+      <w:r>
+        <w:t>work</w:t>
+      </w:r>
+      <w:proofErr w:type="gramEnd"/>
+      <w:r>
+        <w:t>_field</w:t>
+      </w:r>
+      <w:proofErr w:type="spellEnd"/>
+      <w:r>
+        <w:t>": "",</w:t>
+      </w:r>
+    </w:p>
+    <w:p>
+      <w:r>
+        <w:t>            "</w:t>
+      </w:r>
+      <w:proofErr w:type="spellStart"/>
+      <w:proofErr w:type="gramStart"/>
+      <w:r>
+        <w:t>sub</w:t>
+      </w:r>
+      <w:proofErr w:type="gramEnd"/>
+      <w:r>
+        <w:t>_function</w:t>
+      </w:r>
+      <w:proofErr w:type="spellEnd"/>
+      <w:r>
+        <w:t>": "",</w:t>
+      </w:r>
+    </w:p>
+    <w:p>
+      <w:r>
+        <w:t>            "active": "",</w:t>
+      </w:r>
+    </w:p>
+    <w:p>
+      <w:r>
+        <w:t>            "</w:t>
+      </w:r>
+      <w:proofErr w:type="spellStart"/>
+      <w:proofErr w:type="gramStart"/>
+      <w:r>
+        <w:t>personal</w:t>
+      </w:r>
+      <w:proofErr w:type="gramEnd"/>
+      <w:r>
+        <w:t>_cell</w:t>
+      </w:r>
+      <w:proofErr w:type="spellEnd"/>
+      <w:r>
+        <w:t>": "",</w:t>
+      </w:r>
+    </w:p>
+    <w:p>
+      <w:r>
+        <w:t>            "</w:t>
+      </w:r>
+      <w:proofErr w:type="spellStart"/>
+      <w:proofErr w:type="gramStart"/>
+      <w:r>
+        <w:t>official</w:t>
+      </w:r>
+      <w:proofErr w:type="gramEnd"/>
+      <w:r>
+        <w:t>_cell</w:t>
+      </w:r>
+      <w:proofErr w:type="spellEnd"/>
+      <w:r>
+        <w:t>": "",</w:t>
+      </w:r>
+    </w:p>
+    <w:p>
+      <w:r>
+        <w:t>            "email": "",</w:t>
+      </w:r>
+    </w:p>
+    <w:p>
+      <w:r>
+        <w:t>            "</w:t>
+      </w:r>
+      <w:proofErr w:type="spellStart"/>
+      <w:proofErr w:type="gramStart"/>
+      <w:r>
+        <w:t>official</w:t>
+      </w:r>
+      <w:proofErr w:type="gramEnd"/>
+      <w:r>
+        <w:t>_email</w:t>
+      </w:r>
+      <w:proofErr w:type="spellEnd"/>
+      <w:r>
+        <w:t>": "",</w:t>
+      </w:r>
+    </w:p>
+    <w:p>
+      <w:r>
+        <w:t>            "picture</w:t>
+      </w:r>
+      <w:proofErr w:type="gramStart"/>
+      <w:r>
+        <w:t>": "</w:t>
+      </w:r>
+      <w:proofErr w:type="gramEnd"/>
+      <w:r>
+        <w:t>"</w:t>
+      </w:r>
+    </w:p>
+    <w:p>
+      <w:r>
+        <w:t>        },</w:t>
+      </w:r>
+    </w:p>
+    <w:p>
+      <w:r>
+        <w:t>        "tickets</w:t>
+      </w:r>
+      <w:proofErr w:type="gramStart"/>
+      <w:r>
+        <w:t>": {</w:t>
+      </w:r>
+      <w:proofErr w:type="gramEnd"/>
+    </w:p>
+    <w:p>
+      <w:r>
+        <w:t>            "total": 0,</w:t>
+      </w:r>
+    </w:p>
+    <w:p>
+      <w:r>
+        <w:t>            "open": 0,</w:t>
+      </w:r>
+    </w:p>
+    <w:p>
+      <w:r>
+        <w:t>            "running": 0,</w:t>
+      </w:r>
+    </w:p>
+    <w:p>
+      <w:r>
+        <w:t>            "closed": 0</w:t>
+      </w:r>
+    </w:p>
+    <w:p>
+      <w:r>
+        <w:t>        }</w:t>
+      </w:r>
+    </w:p>
+    <w:p>
+      <w:r>
+        <w:lastRenderedPageBreak/>
+        <w:t>    },</w:t>
+      </w:r>
+    </w:p>
+    <w:p>
+      <w:r>
+        <w:t>    "success": </w:t>
+      </w:r>
+      <w:r>
+        <w:rPr>
+          <w:b/>
+          <w:bCs/>
+        </w:rPr>
+        <w:t>true</w:t>
+      </w:r>
+    </w:p>
+    <w:p>
+      <w:r>
+        <w:t>}</w:t>
+      </w:r>
+    </w:p>
+    <w:p/>
+    <w:p/>
+    <w:p>
+      <w:hyperlink r:id="rId12" w:history="1">
+        <w:r>
+          <w:rPr>
+            <w:rStyle w:val="Hyperlink"/>
+          </w:rPr>
+          <w:t>http://localhost:5173/dashboard/user</w:t>
+        </w:r>
+      </w:hyperlink>
+    </w:p>
     <w:p/>
     <w:sectPr>
       <w:pgSz w:w="12240" w:h="15840"/>
@@ -1015,7 +3298,6 @@
   <w:style w:type="character" w:default="1" w:styleId="DefaultParagraphFont">
     <w:name w:val="Default Paragraph Font"/>
     <w:uiPriority w:val="1"/>
-    <w:semiHidden/>
     <w:unhideWhenUsed/>
   </w:style>
   <w:style w:type="table" w:default="1" w:styleId="TableNormal">
@@ -1329,6 +3611,29 @@
       <w:spacing w:val="5"/>
     </w:rPr>
   </w:style>
+  <w:style w:type="character" w:styleId="Hyperlink">
+    <w:name w:val="Hyperlink"/>
+    <w:basedOn w:val="DefaultParagraphFont"/>
+    <w:uiPriority w:val="99"/>
+    <w:unhideWhenUsed/>
+    <w:rsid w:val="001F0CBB"/>
+    <w:rPr>
+      <w:color w:val="0563C1" w:themeColor="hyperlink"/>
+      <w:u w:val="single"/>
+    </w:rPr>
+  </w:style>
+  <w:style w:type="character" w:styleId="UnresolvedMention">
+    <w:name w:val="Unresolved Mention"/>
+    <w:basedOn w:val="DefaultParagraphFont"/>
+    <w:uiPriority w:val="99"/>
+    <w:semiHidden/>
+    <w:unhideWhenUsed/>
+    <w:rsid w:val="001F0CBB"/>
+    <w:rPr>
+      <w:color w:val="605E5C"/>
+      <w:shd w:val="clear" w:color="auto" w:fill="E1DFDD"/>
+    </w:rPr>
+  </w:style>
 </w:styles>
 </file>
 

</xml_diff>